<commit_message>
Update reports with user screenshots and GitHub link
</commit_message>
<xml_diff>
--- a/docs/lab-1-report.docx
+++ b/docs/lab-1-report.docx
@@ -2,6 +2,26 @@
 <file path=word/document.xml><?xml version="1.0" encoding="utf-8"?>
 <w:document xmlns:wpc="http://schemas.microsoft.com/office/word/2010/wordprocessingCanvas" xmlns:mo="http://schemas.microsoft.com/office/mac/office/2008/main" xmlns:mc="http://schemas.openxmlformats.org/markup-compatibility/2006" xmlns:mv="urn:schemas-microsoft-com:mac:vml" xmlns:o="urn:schemas-microsoft-com:office:office" xmlns:r="http://schemas.openxmlformats.org/officeDocument/2006/relationships" xmlns:m="http://schemas.openxmlformats.org/officeDocument/2006/math" xmlns:v="urn:schemas-microsoft-com:vml" xmlns:wp14="http://schemas.microsoft.com/office/word/2010/wordprocessingDrawing" xmlns:wp="http://schemas.openxmlformats.org/drawingml/2006/wordprocessingDrawing" xmlns:w10="urn:schemas-microsoft-com:office:word" xmlns:w="http://schemas.openxmlformats.org/wordprocessingml/2006/main" xmlns:w14="http://schemas.microsoft.com/office/word/2010/wordml" xmlns:wpg="http://schemas.microsoft.com/office/word/2010/wordprocessingGroup" xmlns:wpi="http://schemas.microsoft.com/office/word/2010/wordprocessingInk" xmlns:wne="http://schemas.microsoft.com/office/word/2006/wordml" xmlns:wps="http://schemas.microsoft.com/office/word/2010/wordprocessingShape" mc:Ignorable="w14 wp14">
   <w:body>
+    <w:p>
+      <w:pPr>
+        <w:keepNext/>
+        <w:spacing w:after="100"/>
+      </w:pPr>
+      <w:r>
+        <w:rPr>
+          <w:sz w:val="20"/>
+        </w:rPr>
+        <w:t xml:space="preserve">Репозиторий проекта: </w:t>
+      </w:r>
+      <w:hyperlink r:id="rId10">
+        <w:r>
+          <w:rPr>
+            <w:sz w:val="20"/>
+          </w:rPr>
+          <w:t>https://github.com/Shark10000/student-journal</w:t>
+        </w:r>
+      </w:hyperlink>
+    </w:p>
     <w:p>
       <w:pPr>
         <w:pStyle w:val="Title"/>
@@ -1955,6 +1975,122 @@
         <w:t>Команда seed необязательна: она добавляет четыре демонстрационных студента и двенадцать оценок, если студентов ещё нет. В результате работы создано API студенческого журнала, выполняющее требования варианта 2: хранение в БД, CRUD, агрегация, валидация, поиск, сортировка, пагинация и документация.</w:t>
       </w:r>
     </w:p>
+    <w:p>
+      <w:r>
+        <w:br w:type="page"/>
+      </w:r>
+    </w:p>
+    <w:p>
+      <w:pPr>
+        <w:pStyle w:val="Heading1"/>
+      </w:pPr>
+      <w:r>
+        <w:t>11 Скриншоты документации API</w:t>
+      </w:r>
+    </w:p>
+    <w:p>
+      <w:r>
+        <w:t>На рисунке 1 показана документация ReDoc: параметры поиска, сортировки и пагинации списка студентов. На рисунке 2 — Swagger UI с маршрутами студентов и оценок.</w:t>
+      </w:r>
+    </w:p>
+    <w:p>
+      <w:pPr>
+        <w:keepNext/>
+        <w:jc w:val="center"/>
+      </w:pPr>
+      <w:r>
+        <w:drawing>
+          <wp:inline xmlns:a="http://schemas.openxmlformats.org/drawingml/2006/main" xmlns:pic="http://schemas.openxmlformats.org/drawingml/2006/picture">
+            <wp:extent cx="4680000" cy="3043592"/>
+            <wp:docPr id="1" name="Picture 1"/>
+            <wp:cNvGraphicFramePr>
+              <a:graphicFrameLocks noChangeAspect="1"/>
+            </wp:cNvGraphicFramePr>
+            <a:graphic>
+              <a:graphicData uri="http://schemas.openxmlformats.org/drawingml/2006/picture">
+                <pic:pic>
+                  <pic:nvPicPr>
+                    <pic:cNvPr id="0" name="06-redoc-safari.png"/>
+                    <pic:cNvPicPr/>
+                  </pic:nvPicPr>
+                  <pic:blipFill>
+                    <a:blip r:embed="rId11"/>
+                    <a:stretch>
+                      <a:fillRect/>
+                    </a:stretch>
+                  </pic:blipFill>
+                  <pic:spPr>
+                    <a:xfrm>
+                      <a:off x="0" y="0"/>
+                      <a:ext cx="4680000" cy="3043592"/>
+                    </a:xfrm>
+                    <a:prstGeom prst="rect"/>
+                  </pic:spPr>
+                </pic:pic>
+              </a:graphicData>
+            </a:graphic>
+          </wp:inline>
+        </w:drawing>
+      </w:r>
+    </w:p>
+    <w:p>
+      <w:pPr>
+        <w:pStyle w:val="Caption"/>
+        <w:jc w:val="center"/>
+      </w:pPr>
+      <w:r>
+        <w:t>Рисунок 1 — Документация ReDoc и параметры списка студентов</w:t>
+      </w:r>
+    </w:p>
+    <w:p>
+      <w:pPr>
+        <w:keepNext/>
+        <w:jc w:val="center"/>
+      </w:pPr>
+      <w:r>
+        <w:drawing>
+          <wp:inline xmlns:a="http://schemas.openxmlformats.org/drawingml/2006/main" xmlns:pic="http://schemas.openxmlformats.org/drawingml/2006/picture">
+            <wp:extent cx="4680000" cy="3043592"/>
+            <wp:docPr id="2" name="Picture 2"/>
+            <wp:cNvGraphicFramePr>
+              <a:graphicFrameLocks noChangeAspect="1"/>
+            </wp:cNvGraphicFramePr>
+            <a:graphic>
+              <a:graphicData uri="http://schemas.openxmlformats.org/drawingml/2006/picture">
+                <pic:pic>
+                  <pic:nvPicPr>
+                    <pic:cNvPr id="0" name="09-swagger-safari.png"/>
+                    <pic:cNvPicPr/>
+                  </pic:nvPicPr>
+                  <pic:blipFill>
+                    <a:blip r:embed="rId12"/>
+                    <a:stretch>
+                      <a:fillRect/>
+                    </a:stretch>
+                  </pic:blipFill>
+                  <pic:spPr>
+                    <a:xfrm>
+                      <a:off x="0" y="0"/>
+                      <a:ext cx="4680000" cy="3043592"/>
+                    </a:xfrm>
+                    <a:prstGeom prst="rect"/>
+                  </pic:spPr>
+                </pic:pic>
+              </a:graphicData>
+            </a:graphic>
+          </wp:inline>
+        </w:drawing>
+      </w:r>
+    </w:p>
+    <w:p>
+      <w:pPr>
+        <w:pStyle w:val="Caption"/>
+        <w:jc w:val="center"/>
+      </w:pPr>
+      <w:r>
+        <w:t>Рисунок 2 — Маршруты API в Swagger UI</w:t>
+      </w:r>
+    </w:p>
     <w:sectPr>
       <w:footerReference w:type="default" r:id="rId9"/>
       <w:pgSz w:w="11906" w:h="16838"/>
@@ -2696,7 +2832,7 @@
     <w:qFormat/>
     <w:rsid w:val="00FC693F"/>
     <w:pPr>
-      <w:spacing w:after="240" w:line="240" w:lineRule="auto"/>
+      <w:spacing w:after="120" w:line="240" w:lineRule="auto"/>
       <w:contextualSpacing/>
     </w:pPr>
     <w:rPr>

</xml_diff>

<commit_message>
Add student attribution and course to laboratory reports
</commit_message>
<xml_diff>
--- a/docs/lab-1-report.docx
+++ b/docs/lab-1-report.docx
@@ -5,7 +5,7 @@
     <w:p>
       <w:pPr>
         <w:keepNext/>
-        <w:spacing w:after="100"/>
+        <w:spacing w:after="80" w:line="264" w:lineRule="auto"/>
       </w:pPr>
       <w:r>
         <w:rPr>
@@ -25,12 +25,40 @@
     <w:p>
       <w:pPr>
         <w:pStyle w:val="Title"/>
+        <w:spacing w:after="40"/>
       </w:pPr>
       <w:r>
         <w:t>Отчёт по лабораторной работе 1</w:t>
       </w:r>
     </w:p>
     <w:p>
+      <w:pPr>
+        <w:keepNext/>
+        <w:spacing w:after="20" w:line="264" w:lineRule="auto"/>
+      </w:pPr>
+      <w:r>
+        <w:rPr>
+          <w:sz w:val="22"/>
+        </w:rPr>
+        <w:t>Выполнила Астахова Мария Дмитриевна, группа БСТ2551</w:t>
+      </w:r>
+    </w:p>
+    <w:p>
+      <w:pPr>
+        <w:keepNext/>
+        <w:spacing w:after="80" w:line="240" w:lineRule="auto"/>
+      </w:pPr>
+      <w:r>
+        <w:rPr>
+          <w:sz w:val="22"/>
+        </w:rPr>
+        <w:t>Дисциплина: Программная инженерия</w:t>
+      </w:r>
+    </w:p>
+    <w:p>
+      <w:pPr>
+        <w:spacing w:after="80" w:line="264" w:lineRule="auto"/>
+      </w:pPr>
       <w:r>
         <w:rPr>
           <w:b/>
@@ -39,6 +67,9 @@
       </w:r>
     </w:p>
     <w:p>
+      <w:pPr>
+        <w:spacing w:after="80" w:line="264" w:lineRule="auto"/>
+      </w:pPr>
       <w:r>
         <w:t>Вариант 2    Студенческий журнал    2026 год</w:t>
       </w:r>
@@ -52,11 +83,17 @@
       </w:r>
     </w:p>
     <w:p>
+      <w:pPr>
+        <w:spacing w:after="80" w:line="264" w:lineRule="auto"/>
+      </w:pPr>
       <w:r>
         <w:t>Цель работы — освоить разработку REST API, HTTP-методы GET, POST, PUT и DELETE, маршрутизацию, сериализацию и хранение данных в базе. Для варианта 2 реализован студенческий журнал: учёт студентов и оценок с расчётом среднего балла.</w:t>
       </w:r>
     </w:p>
     <w:p>
+      <w:pPr>
+        <w:spacing w:after="80" w:line="264" w:lineRule="auto"/>
+      </w:pPr>
       <w:r>
         <w:t>В работе реализованы CRUD-операции, поиск и фильтрация, проверка входных данных, сортировка, пагинация и автоматически формируемая документация. API включает 12 операций, что превышает требование о наличии минимум семи эндпоинтов.</w:t>
       </w:r>
@@ -70,13 +107,16 @@
       </w:r>
     </w:p>
     <w:p>
+      <w:pPr>
+        <w:spacing w:after="80" w:line="264" w:lineRule="auto"/>
+      </w:pPr>
       <w:r>
         <w:t>Backend написан на Python с использованием FastAPI, SQLAlchemy и SQLite. MicroService из исходной папки использован как ориентир разделения приложения на роутеры, схемы, ORM-модели и работу с БД. Для журнала создан самостоятельный API с одной базой данных.</w:t>
       </w:r>
     </w:p>
     <w:p>
       <w:pPr>
-        <w:spacing w:line="240" w:lineRule="auto" w:after="180"/>
+        <w:spacing w:line="264" w:lineRule="auto" w:after="80"/>
       </w:pPr>
       <w:r>
         <w:rPr>
@@ -111,11 +151,17 @@
       </w:r>
     </w:p>
     <w:p>
+      <w:pPr>
+        <w:spacing w:after="80" w:line="264" w:lineRule="auto"/>
+      </w:pPr>
       <w:r>
         <w:t>Student содержит id, full_name, group и email. Email уникален. Grade содержит id, student_id, subject, value, date и comment. Студент связан с оценками отношением один ко многим. Удаление студента каскадно удаляет его оценки; внешние ключи SQLite включены.</w:t>
       </w:r>
     </w:p>
     <w:p>
+      <w:pPr>
+        <w:spacing w:after="80" w:line="264" w:lineRule="auto"/>
+      </w:pPr>
       <w:r>
         <w:t>База хранится в backend/journal.db и сохраняется между запусками. Таблицы создаются при старте приложения. Сессия БД передаётся обработчикам через Depends и закрывается после запроса. Сохранение выполняется в транзакции; при конфликте уникальности выполняется откат.</w:t>
       </w:r>

</xml_diff>